<commit_message>
docs: atualiza o MER com as decisoes de modelagem de 15/09
- Praca: quantidade_garcons; Comanda: quantidade_pessoas e composicao; ItemDoPedido: data_hora_registro
- Usuario: chave_sessao e segredo_totp (nome alinhado ao banco)
- Comanda sem status cancelada; categoria do cardapio como lista fechada
- REL04 com participacao opcional para Comanda (0,n)
- REL09 fechado como N:N simples
- RestricaoAlimentar marcada como ponto de atencao LGPD
- Nova secao de auditoria (RegistroAuditoria e REL10), conforme a politica de log
</commit_message>
<xml_diff>
--- a/docs/modelagem/mer/GASTRA_MER.docx
+++ b/docs/modelagem/mer/GASTRA_MER.docx
@@ -220,6 +220,20 @@
           <w:ilvl w:val="0"/>
           <w:numId w:val="1"/>
         </w:numPr>
+      </w:pPr>
+      <w:proofErr w:type="gramStart"/>
+      <w:r>
+        <w:t>quantidade_garcons (quantos garçons a praça comporta por turno; entrada da alocação — RN03)</w:t>
+      </w:r>
+      <w:proofErr w:type="gramEnd"/>
+    </w:p>
+    <w:p>
+      <w:pPr>
+        <w:pStyle w:val="PargrafodaLista"/>
+        <w:numPr>
+          <w:ilvl w:val="0"/>
+          <w:numId w:val="1"/>
+        </w:numPr>
         <w:spacing w:after="200"/>
       </w:pPr>
       <w:proofErr w:type="spellStart"/>
@@ -404,25 +418,34 @@
           <w:ilvl w:val="0"/>
           <w:numId w:val="1"/>
         </w:numPr>
+      </w:pPr>
+      <w:proofErr w:type="gramStart"/>
+      <w:r>
+        <w:t>chave_sessao (identificador da sessão vigente; trocado no logoff, na inativação e na troca de papel, invalida na hora os acessos emitidos antes — RF17, RF18)</w:t>
+      </w:r>
+      <w:proofErr w:type="gramEnd"/>
+    </w:p>
+    <w:p>
+      <w:pPr>
+        <w:pStyle w:val="PargrafodaLista"/>
+        <w:numPr>
+          <w:ilvl w:val="0"/>
+          <w:numId w:val="1"/>
+        </w:numPr>
         <w:spacing w:after="200"/>
       </w:pPr>
       <w:proofErr w:type="spellStart"/>
       <w:r>
-        <w:t>totp_secret</w:t>
-      </w:r>
-      <w:proofErr w:type="spellEnd"/>
-      <w:r>
-        <w:t xml:space="preserve"> (opcional — só preenchido </w:t>
-      </w:r>
+        <w:t>segredo_totp (opcional — só preenchido para papéis Gerente/Coordenador; gerado uma única vez e armazenado criptografado, nunca reexibido em texto claro — RN07)</w:t>
+      </w:r>
+      <w:proofErr w:type="spellEnd"/>
+      <w:r/>
       <w:r>
         <w:rPr>
           <w:u w:val="single"/>
         </w:rPr>
-        <w:t>para</w:t>
-      </w:r>
-      <w:r>
-        <w:t xml:space="preserve"> papéis Gerente/Coordenador; armazenado de forma segura, nunca reexibido em texto claro)</w:t>
-      </w:r>
+      </w:r>
+      <w:r/>
     </w:p>
     <w:p>
       <w:pPr>
@@ -500,12 +523,38 @@
           <w:numId w:val="1"/>
         </w:numPr>
       </w:pPr>
-      <w:r>
-        <w:t>status</w:t>
-      </w:r>
-      <w:r>
-        <w:t xml:space="preserve"> (aberta | fechada | cancelada)</w:t>
-      </w:r>
+      <w:proofErr w:type="gramStart"/>
+      <w:r>
+        <w:t>quantidade_pessoas (informada pelo garçom na abertura)</w:t>
+      </w:r>
+      <w:proofErr w:type="gramEnd"/>
+    </w:p>
+    <w:p>
+      <w:pPr>
+        <w:pStyle w:val="PargrafodaLista"/>
+        <w:numPr>
+          <w:ilvl w:val="0"/>
+          <w:numId w:val="1"/>
+        </w:numPr>
+      </w:pPr>
+      <w:proofErr w:type="gramStart"/>
+      <w:r>
+        <w:t>composicao (Solo | Casal | Grupo pequeno | Família | Grupo grande — RN01; sugerida pelo sistema a partir de quantidade_pessoas e confirmada ou ajustada pelo garçom; passa a Família quando há item infantil em mesa de 3 ou mais pessoas)</w:t>
+      </w:r>
+      <w:proofErr w:type="gramEnd"/>
+    </w:p>
+    <w:p>
+      <w:pPr>
+        <w:pStyle w:val="PargrafodaLista"/>
+        <w:numPr>
+          <w:ilvl w:val="0"/>
+          <w:numId w:val="1"/>
+        </w:numPr>
+      </w:pPr>
+      <w:r>
+        <w:t>status (aberta | fechada)</w:t>
+      </w:r>
+      <w:r/>
     </w:p>
     <w:p>
       <w:pPr>
@@ -764,7 +813,7 @@
         </w:numPr>
       </w:pPr>
       <w:r>
-        <w:t>categoria</w:t>
+        <w:t>categoria (lista fechada: entrada | prato principal | sobremesa | bebida)</w:t>
       </w:r>
     </w:p>
     <w:p>
@@ -805,39 +854,23 @@
       </w:pPr>
       <w:proofErr w:type="spellStart"/>
       <w:r>
-        <w:t>flags_dieteticas</w:t>
-      </w:r>
-      <w:proofErr w:type="spellEnd"/>
-      <w:r>
-        <w:t xml:space="preserve"> </w:t>
-      </w:r>
-      <w:r>
-        <w:t xml:space="preserve">(multivalorado; lista fechada: vegano, vegetariano, </w:t>
-      </w:r>
-      <w:proofErr w:type="spellStart"/>
-      <w:r>
-        <w:t>sem_gluten</w:t>
-      </w:r>
-      <w:proofErr w:type="spellEnd"/>
-      <w:r>
-        <w:t xml:space="preserve">, </w:t>
-      </w:r>
-      <w:proofErr w:type="spellStart"/>
-      <w:r>
-        <w:t>sem_lactose</w:t>
-      </w:r>
-      <w:proofErr w:type="spellEnd"/>
-      <w:r>
-        <w:t xml:space="preserve">, </w:t>
-      </w:r>
-      <w:proofErr w:type="spellStart"/>
-      <w:r>
-        <w:t>opcao_infantil</w:t>
-      </w:r>
-      <w:proofErr w:type="spellEnd"/>
-      <w:r>
-        <w:t>)</w:t>
-      </w:r>
+        <w:t>flags_dieteticas (multivalorado; lista fechada: vegano, vegetariano, sem_gluten, sem_lactose, opcao_infantil — no esquema físico vira tabela própria, para respeitar a 1FN)</w:t>
+      </w:r>
+      <w:proofErr w:type="spellEnd"/>
+      <w:r/>
+      <w:r/>
+      <w:proofErr w:type="spellStart"/>
+      <w:r/>
+      <w:proofErr w:type="spellEnd"/>
+      <w:r/>
+      <w:proofErr w:type="spellStart"/>
+      <w:r/>
+      <w:proofErr w:type="spellEnd"/>
+      <w:r/>
+      <w:proofErr w:type="spellStart"/>
+      <w:r/>
+      <w:proofErr w:type="spellEnd"/>
+      <w:r/>
     </w:p>
     <w:p>
       <w:pPr>
@@ -960,8 +993,22 @@
           <w:numId w:val="1"/>
         </w:numPr>
       </w:pPr>
-      <w:r>
-        <w:t>status (pendente | entregue | cancelado)</w:t>
+      <w:proofErr w:type="gramStart"/>
+      <w:r>
+        <w:t>data_hora_registro (momento do lançamento; base do tempo de atendimento e da ordem das pendências)</w:t>
+      </w:r>
+      <w:proofErr w:type="gramEnd"/>
+    </w:p>
+    <w:p>
+      <w:pPr>
+        <w:pStyle w:val="PargrafodaLista"/>
+        <w:numPr>
+          <w:ilvl w:val="0"/>
+          <w:numId w:val="1"/>
+        </w:numPr>
+      </w:pPr>
+      <w:r>
+        <w:t>status (pendente | entregue | cancelado — cancelado exige motivo_cancelamento; RN02)</w:t>
       </w:r>
     </w:p>
     <w:p>
@@ -1034,12 +1081,10 @@
         <w:t xml:space="preserve">Participação: </w:t>
       </w:r>
       <w:r>
-        <w:t xml:space="preserve">obrigatória para </w:t>
-      </w:r>
-      <w:proofErr w:type="spellStart"/>
-      <w:r>
-        <w:t>ItemDoPedido</w:t>
-      </w:r>
+        <w:t>opcional para Comanda — cardinalidade (0,n): a comanda é aberta antes do primeiro pedido; obrigatória para ItemDoPedido</w:t>
+      </w:r>
+      <w:proofErr w:type="spellStart"/>
+      <w:r/>
       <w:proofErr w:type="spellEnd"/>
     </w:p>
     <w:p>
@@ -1492,12 +1537,10 @@
       </w:pPr>
       <w:proofErr w:type="spellStart"/>
       <w:r>
-        <w:t>observacao_livre</w:t>
-      </w:r>
-      <w:proofErr w:type="spellEnd"/>
-      <w:r>
-        <w:t xml:space="preserve"> (opcional)</w:t>
-      </w:r>
+        <w:t>observacao_livre (opcional; apagada no fechamento da comanda, quando fica só a categoria)</w:t>
+      </w:r>
+      <w:proofErr w:type="spellEnd"/>
+      <w:r/>
     </w:p>
     <w:p>
       <w:pPr>
@@ -1580,6 +1623,21 @@
       </w:r>
       <w:r>
         <w:t>ENT04, ENT08</w:t>
+      </w:r>
+    </w:p>
+    <w:p>
+      <w:pPr>
+        <w:spacing w:after="80"/>
+      </w:pPr>
+      <w:r>
+        <w:rPr>
+          <w:b/>
+          <w:bCs/>
+        </w:rPr>
+        <w:t xml:space="preserve">Ponto de atenção LGPD: </w:t>
+      </w:r>
+      <w:r>
+        <w:t>a categoria alergia e a observação livre podem conter dado referente à saúde (dado pessoal sensível, LGPD art. 5º, II). A restrição só existe vinculada à comanda ativa, nunca aparece em log, e a observação livre é eliminada no fechamento da comanda (RN04, RN05, issue #40).</w:t>
       </w:r>
     </w:p>
     <w:p>
@@ -1755,27 +1813,25 @@
           <w:sz w:val="24"/>
           <w:szCs w:val="24"/>
         </w:rPr>
-        <w:t xml:space="preserve">REL09 — </w:t>
-      </w:r>
-      <w:proofErr w:type="spellStart"/>
-      <w:r>
-        <w:rPr>
-          <w:b/>
-          <w:bCs/>
-          <w:sz w:val="24"/>
-          <w:szCs w:val="24"/>
-        </w:rPr>
-        <w:t>Promocao</w:t>
-      </w:r>
-      <w:proofErr w:type="spellEnd"/>
-      <w:r>
-        <w:rPr>
-          <w:b/>
-          <w:bCs/>
-          <w:sz w:val="24"/>
-          <w:szCs w:val="24"/>
-        </w:rPr>
-        <w:t xml:space="preserve"> aplica-se a </w:t>
+        <w:t>REL09 — Promocao aplica-se a ItemDoCardápio</w:t>
+      </w:r>
+      <w:proofErr w:type="spellStart"/>
+      <w:r>
+        <w:rPr>
+          <w:b/>
+          <w:bCs/>
+          <w:sz w:val="24"/>
+          <w:szCs w:val="24"/>
+        </w:rPr>
+      </w:r>
+      <w:proofErr w:type="spellEnd"/>
+      <w:r>
+        <w:rPr>
+          <w:b/>
+          <w:bCs/>
+          <w:sz w:val="24"/>
+          <w:szCs w:val="24"/>
+        </w:rPr>
       </w:r>
       <w:proofErr w:type="spellStart"/>
       <w:proofErr w:type="gramStart"/>
@@ -1786,17 +1842,15 @@
           <w:sz w:val="24"/>
           <w:szCs w:val="24"/>
         </w:rPr>
-        <w:t>ItemDoCardápio</w:t>
-      </w:r>
-      <w:proofErr w:type="spellEnd"/>
-      <w:r>
-        <w:rPr>
-          <w:b/>
-          <w:bCs/>
-          <w:sz w:val="24"/>
-          <w:szCs w:val="24"/>
-        </w:rPr>
-        <w:t xml:space="preserve">  [</w:t>
+      </w:r>
+      <w:proofErr w:type="spellEnd"/>
+      <w:r>
+        <w:rPr>
+          <w:b/>
+          <w:bCs/>
+          <w:sz w:val="24"/>
+          <w:szCs w:val="24"/>
+        </w:rPr>
       </w:r>
       <w:proofErr w:type="gramEnd"/>
       <w:r>
@@ -1806,7 +1860,6 @@
           <w:sz w:val="24"/>
           <w:szCs w:val="24"/>
         </w:rPr>
-        <w:t>DECISÃO PENDENTE]</w:t>
       </w:r>
     </w:p>
     <w:p>
@@ -1837,6 +1890,254 @@
       </w:r>
       <w:r>
         <w:t>ENT09, ENT05</w:t>
+      </w:r>
+    </w:p>
+    <w:p>
+      <w:pPr>
+        <w:spacing w:after="80"/>
+      </w:pPr>
+      <w:r>
+        <w:rPr>
+          <w:b/>
+          <w:bCs/>
+        </w:rPr>
+        <w:t xml:space="preserve">Decisão (15/09/2026): </w:t>
+      </w:r>
+      <w:r>
+        <w:t>relacionamento N:N simples. Período e desconto ficam na Promoção; a entidade associativa guarda apenas os identificadores da promoção e do item.</w:t>
+      </w:r>
+    </w:p>
+    <w:p>
+      <w:pPr>
+        <w:pStyle w:val="Ttulo1"/>
+        <w:spacing w:before="300" w:after="200"/>
+      </w:pPr>
+      <w:r>
+        <w:t>5. Auditoria</w:t>
+      </w:r>
+      <w:r/>
+    </w:p>
+    <w:p>
+      <w:pPr>
+        <w:spacing w:before="200" w:after="100"/>
+      </w:pPr>
+      <w:r>
+        <w:rPr>
+          <w:b/>
+          <w:bCs/>
+          <w:sz w:val="24"/>
+          <w:szCs w:val="24"/>
+        </w:rPr>
+        <w:t>ENT10 — RegistroAuditoria</w:t>
+      </w:r>
+    </w:p>
+    <w:p>
+      <w:r>
+        <w:rPr>
+          <w:b/>
+          <w:bCs/>
+        </w:rPr>
+        <w:t>Atributos:</w:t>
+      </w:r>
+    </w:p>
+    <w:p>
+      <w:pPr>
+        <w:pStyle w:val="PargrafodaLista"/>
+        <w:numPr>
+          <w:ilvl w:val="0"/>
+          <w:numId w:val="1"/>
+        </w:numPr>
+      </w:pPr>
+      <w:proofErr w:type="gramStart"/>
+      <w:r>
+        <w:t>id_registro (PK)</w:t>
+      </w:r>
+      <w:proofErr w:type="gramEnd"/>
+    </w:p>
+    <w:p>
+      <w:pPr>
+        <w:pStyle w:val="PargrafodaLista"/>
+        <w:numPr>
+          <w:ilvl w:val="0"/>
+          <w:numId w:val="1"/>
+        </w:numPr>
+      </w:pPr>
+      <w:proofErr w:type="gramStart"/>
+      <w:r>
+        <w:t>data_hora_utc</w:t>
+      </w:r>
+      <w:proofErr w:type="gramEnd"/>
+    </w:p>
+    <w:p>
+      <w:pPr>
+        <w:pStyle w:val="PargrafodaLista"/>
+        <w:numPr>
+          <w:ilvl w:val="0"/>
+          <w:numId w:val="1"/>
+        </w:numPr>
+      </w:pPr>
+      <w:proofErr w:type="gramStart"/>
+      <w:r>
+        <w:t>evento (código fixo, ex.: ALOCACAO_AJUSTADA)</w:t>
+      </w:r>
+      <w:proofErr w:type="gramEnd"/>
+    </w:p>
+    <w:p>
+      <w:pPr>
+        <w:pStyle w:val="PargrafodaLista"/>
+        <w:numPr>
+          <w:ilvl w:val="0"/>
+          <w:numId w:val="1"/>
+        </w:numPr>
+      </w:pPr>
+      <w:proofErr w:type="gramStart"/>
+      <w:r>
+        <w:t>resultado (sucesso | falha)</w:t>
+      </w:r>
+      <w:proofErr w:type="gramEnd"/>
+    </w:p>
+    <w:p>
+      <w:pPr>
+        <w:pStyle w:val="PargrafodaLista"/>
+        <w:numPr>
+          <w:ilvl w:val="0"/>
+          <w:numId w:val="1"/>
+        </w:numPr>
+      </w:pPr>
+      <w:proofErr w:type="gramStart"/>
+      <w:r>
+        <w:t>papel (papel do ator no momento da ação)</w:t>
+      </w:r>
+      <w:proofErr w:type="gramEnd"/>
+    </w:p>
+    <w:p>
+      <w:pPr>
+        <w:pStyle w:val="PargrafodaLista"/>
+        <w:numPr>
+          <w:ilvl w:val="0"/>
+          <w:numId w:val="1"/>
+        </w:numPr>
+      </w:pPr>
+      <w:proofErr w:type="gramStart"/>
+      <w:r>
+        <w:t>entidade e id_entidade (alvo da ação)</w:t>
+      </w:r>
+      <w:proofErr w:type="gramEnd"/>
+    </w:p>
+    <w:p>
+      <w:pPr>
+        <w:pStyle w:val="PargrafodaLista"/>
+        <w:numPr>
+          <w:ilvl w:val="0"/>
+          <w:numId w:val="1"/>
+        </w:numPr>
+      </w:pPr>
+      <w:proofErr w:type="gramStart"/>
+      <w:r>
+        <w:t>detalhes (somente os campos permitidos pela política de log)</w:t>
+      </w:r>
+      <w:proofErr w:type="gramEnd"/>
+    </w:p>
+    <w:p>
+      <w:pPr>
+        <w:pStyle w:val="PargrafodaLista"/>
+        <w:numPr>
+          <w:ilvl w:val="0"/>
+          <w:numId w:val="1"/>
+        </w:numPr>
+      </w:pPr>
+      <w:proofErr w:type="gramStart"/>
+      <w:r>
+        <w:t>ip (opcional — só em eventos de autenticação)</w:t>
+      </w:r>
+      <w:proofErr w:type="gramEnd"/>
+    </w:p>
+    <w:p>
+      <w:pPr>
+        <w:pStyle w:val="PargrafodaLista"/>
+        <w:numPr>
+          <w:ilvl w:val="0"/>
+          <w:numId w:val="1"/>
+        </w:numPr>
+      </w:pPr>
+      <w:proofErr w:type="gramStart"/>
+      <w:r>
+        <w:t>id_correlacao (liga o evento ao log técnico da mesma requisição)</w:t>
+      </w:r>
+      <w:proofErr w:type="gramEnd"/>
+    </w:p>
+    <w:p>
+      <w:pPr>
+        <w:spacing w:before="200" w:after="100"/>
+      </w:pPr>
+      <w:r>
+        <w:rPr>
+          <w:b/>
+          <w:bCs/>
+          <w:sz w:val="24"/>
+          <w:szCs w:val="24"/>
+        </w:rPr>
+        <w:t>REL10 — RegistroAuditoria é gerado por um Usuário</w:t>
+      </w:r>
+    </w:p>
+    <w:p>
+      <w:pPr>
+        <w:spacing w:after="80"/>
+      </w:pPr>
+      <w:r>
+        <w:rPr>
+          <w:b/>
+          <w:bCs/>
+        </w:rPr>
+        <w:t xml:space="preserve">Cardinalidade: </w:t>
+      </w:r>
+      <w:r>
+        <w:t>N:1 (um usuário gera vários registros; cada registro tem no máximo um usuário)</w:t>
+      </w:r>
+    </w:p>
+    <w:p>
+      <w:pPr>
+        <w:spacing w:after="80"/>
+      </w:pPr>
+      <w:r>
+        <w:rPr>
+          <w:b/>
+          <w:bCs/>
+        </w:rPr>
+        <w:t xml:space="preserve">Participação: </w:t>
+      </w:r>
+      <w:r>
+        <w:t>opcional para RegistroAuditoria (falha de login com e-mail inexistente não tem usuário)</w:t>
+      </w:r>
+    </w:p>
+    <w:p>
+      <w:pPr>
+        <w:spacing w:after="80"/>
+      </w:pPr>
+      <w:r>
+        <w:rPr>
+          <w:b/>
+          <w:bCs/>
+        </w:rPr>
+        <w:t xml:space="preserve">Entidades envolvidas: </w:t>
+      </w:r>
+      <w:r>
+        <w:t>ENT10, ENT03</w:t>
+      </w:r>
+    </w:p>
+    <w:p>
+      <w:pPr>
+        <w:spacing w:after="80"/>
+      </w:pPr>
+      <w:r>
+        <w:rPr>
+          <w:b/>
+          <w:bCs/>
+        </w:rPr>
+        <w:t xml:space="preserve">Regra de negócio: </w:t>
+      </w:r>
+      <w:r>
+        <w:t>somente inserção — registros não são alterados nem apagados, exceto pela eliminação ao fim do prazo de retenção de 6 meses (GASTRA_Politica_Log_Auditoria.md)</w:t>
       </w:r>
     </w:p>
     <w:sectPr>

</xml_diff>

<commit_message>
feat: ajuste manual da composicao da mesa passa a valer sobre a regra automatica
- Comanda guarda se a composicao foi trocada pelo garcom; nesse caso o item infantil
  nao reclassifica mais a mesa (decisao da dupla em 16/09)
- Confirmar a sugestao sem mudar nada nao congela a regra, para nao quebrar a RN01
- Coluna composicao_ajustada_manualmente, MER e DER atualizados
- 2 testes novos
</commit_message>
<xml_diff>
--- a/docs/modelagem/mer/GASTRA_MER.docx
+++ b/docs/modelagem/mer/GASTRA_MER.docx
@@ -540,6 +540,20 @@
       <w:proofErr w:type="gramStart"/>
       <w:r>
         <w:t>composicao (Solo | Casal | Grupo pequeno | Família | Grupo grande — RN01; sugerida pelo sistema a partir de quantidade_pessoas e confirmada ou ajustada pelo garçom; passa a Família quando há item infantil em mesa de 3 ou mais pessoas)</w:t>
+      </w:r>
+      <w:proofErr w:type="gramEnd"/>
+    </w:p>
+    <w:p>
+      <w:pPr>
+        <w:pStyle w:val="PargrafodaLista"/>
+        <w:numPr>
+          <w:ilvl w:val="0"/>
+          <w:numId w:val="1"/>
+        </w:numPr>
+      </w:pPr>
+      <w:proofErr w:type="gramStart"/>
+      <w:r>
+        <w:t>composicao_ajustada_manualmente (verdadeiro quando o garçom troca a composição sugerida; a partir daí o sistema não reclassifica mais sozinho — decisão da dupla, 16/09)</w:t>
       </w:r>
       <w:proofErr w:type="gramEnd"/>
     </w:p>

</xml_diff>

<commit_message>
docs: marca no DER e no MER os atributos opcionais apontados pela engenharia reversa
</commit_message>
<xml_diff>
--- a/docs/modelagem/mer/GASTRA_MER.docx
+++ b/docs/modelagem/mer/GASTRA_MER.docx
@@ -511,7 +511,7 @@
       </w:pPr>
       <w:proofErr w:type="spellStart"/>
       <w:r>
-        <w:t>data_hora_fechamento</w:t>
+        <w:t>data_hora_fechamento (opcional — vazio enquanto a comanda está aberta)</w:t>
       </w:r>
       <w:proofErr w:type="spellEnd"/>
     </w:p>
@@ -910,7 +910,7 @@
         <w:spacing w:after="200"/>
       </w:pPr>
       <w:r>
-        <w:t>imagem (referência ao arquivo/URL — decisão de armazenamento fica para o esquema físico)</w:t>
+        <w:t>imagem (opcional — referência ao arquivo/URL; decisão de armazenamento fica para o esquema físico)</w:t>
       </w:r>
     </w:p>
     <w:p>
@@ -2020,7 +2020,7 @@
       </w:pPr>
       <w:proofErr w:type="gramStart"/>
       <w:r>
-        <w:t>papel (papel do ator no momento da ação)</w:t>
+        <w:t>papel (opcional — papel do ator no momento da ação; vazio quando não há usuário identificado)</w:t>
       </w:r>
       <w:proofErr w:type="gramEnd"/>
     </w:p>
@@ -2034,7 +2034,7 @@
       </w:pPr>
       <w:proofErr w:type="gramStart"/>
       <w:r>
-        <w:t>entidade e id_entidade (alvo da ação)</w:t>
+        <w:t>entidade e id_entidade (opcionais — alvo da ação; vazios em eventos sem alvo, como login)</w:t>
       </w:r>
       <w:proofErr w:type="gramEnd"/>
     </w:p>
@@ -2048,7 +2048,7 @@
       </w:pPr>
       <w:proofErr w:type="gramStart"/>
       <w:r>
-        <w:t>detalhes (somente os campos permitidos pela política de log)</w:t>
+        <w:t>detalhes (opcional — somente os campos permitidos pela política de log)</w:t>
       </w:r>
       <w:proofErr w:type="gramEnd"/>
     </w:p>
@@ -2076,7 +2076,7 @@
       </w:pPr>
       <w:proofErr w:type="gramStart"/>
       <w:r>
-        <w:t>id_correlacao (liga o evento ao log técnico da mesma requisição)</w:t>
+        <w:t>id_correlacao (opcional — liga o evento ao log técnico da mesma requisição; vazio em rotinas sem requisição, como a eliminação por prazo)</w:t>
       </w:r>
       <w:proofErr w:type="gramEnd"/>
     </w:p>

</xml_diff>

<commit_message>
docs(modelagem): AvaliacaoAtendimento no DER e no MER (ENT11, REL11)
- DER: entidade, atributos e relacionamento "recebe" com a Comanda, (0,1)/(1,1), sem cruzar linhas.
  Feito com as classes do brModelo (der/acrescentar_avaliacao.js); conferido reabrindo o arquivo.
- MER: ENT11 e REL11 com a RN08.
- Revisão: não é entidade fraca (tem identificador próprio); a dependência é de existência.

Refs #196
</commit_message>
<xml_diff>
--- a/docs/modelagem/mer/GASTRA_MER.docx
+++ b/docs/modelagem/mer/GASTRA_MER.docx
@@ -2152,6 +2152,169 @@
       </w:r>
       <w:r>
         <w:t>somente inserção — registros não são alterados nem apagados, exceto pela eliminação ao fim do prazo de retenção de 6 meses (GASTRA_Politica_Log_Auditoria.md)</w:t>
+      </w:r>
+    </w:p>
+    <w:p>
+      <w:pPr>
+        <w:pStyle w:val="Ttulo1"/>
+        <w:spacing w:before="300" w:after="200"/>
+      </w:pPr>
+      <w:r>
+        <w:t xml:space="preserve">6. Avaliação do atendimento</w:t>
+      </w:r>
+      <w:r/>
+    </w:p>
+    <w:p>
+      <w:pPr>
+        <w:spacing w:before="200" w:after="100"/>
+      </w:pPr>
+      <w:r>
+        <w:rPr>
+          <w:b/>
+          <w:bCs/>
+          <w:sz w:val="24"/>
+          <w:szCs w:val="24"/>
+        </w:rPr>
+        <w:t xml:space="preserve">ENT11 — AvaliacaoAtendimento</w:t>
+      </w:r>
+    </w:p>
+    <w:p>
+      <w:r>
+        <w:rPr>
+          <w:b/>
+          <w:bCs/>
+        </w:rPr>
+        <w:t xml:space="preserve">Atributos:</w:t>
+      </w:r>
+    </w:p>
+    <w:p>
+      <w:pPr>
+        <w:pStyle w:val="PargrafodaLista"/>
+        <w:numPr>
+          <w:ilvl w:val="0"/>
+          <w:numId w:val="1"/>
+        </w:numPr>
+      </w:pPr>
+      <w:proofErr w:type="gramStart"/>
+      <w:r>
+        <w:t xml:space="preserve">id_avaliacao (PK)</w:t>
+      </w:r>
+      <w:proofErr w:type="gramEnd"/>
+    </w:p>
+    <w:p>
+      <w:pPr>
+        <w:pStyle w:val="PargrafodaLista"/>
+        <w:numPr>
+          <w:ilvl w:val="0"/>
+          <w:numId w:val="1"/>
+        </w:numPr>
+      </w:pPr>
+      <w:proofErr w:type="gramStart"/>
+      <w:r>
+        <w:t xml:space="preserve">nota (inteiro de 1 a 5)</w:t>
+      </w:r>
+      <w:proofErr w:type="gramEnd"/>
+    </w:p>
+    <w:p>
+      <w:pPr>
+        <w:pStyle w:val="PargrafodaLista"/>
+        <w:numPr>
+          <w:ilvl w:val="0"/>
+          <w:numId w:val="1"/>
+        </w:numPr>
+      </w:pPr>
+      <w:proofErr w:type="gramStart"/>
+      <w:r>
+        <w:t xml:space="preserve">comentario (opcional — texto livre; a tela avisa para não escrever dado pessoal, e ele nunca sai em log, view ou relatório)</w:t>
+      </w:r>
+      <w:proofErr w:type="gramEnd"/>
+    </w:p>
+    <w:p>
+      <w:pPr>
+        <w:pStyle w:val="PargrafodaLista"/>
+        <w:numPr>
+          <w:ilvl w:val="0"/>
+          <w:numId w:val="1"/>
+        </w:numPr>
+      </w:pPr>
+      <w:proofErr w:type="gramStart"/>
+      <w:r>
+        <w:t xml:space="preserve">data_hora_envio</w:t>
+      </w:r>
+      <w:proofErr w:type="gramEnd"/>
+    </w:p>
+    <w:p>
+      <w:pPr>
+        <w:spacing w:before="200" w:after="100"/>
+      </w:pPr>
+      <w:r>
+        <w:rPr>
+          <w:b/>
+          <w:bCs/>
+          <w:sz w:val="24"/>
+          <w:szCs w:val="24"/>
+        </w:rPr>
+        <w:t xml:space="preserve">REL11 — Comanda recebe uma AvaliacaoAtendimento</w:t>
+      </w:r>
+    </w:p>
+    <w:p>
+      <w:pPr>
+        <w:spacing w:after="80"/>
+      </w:pPr>
+      <w:r>
+        <w:rPr>
+          <w:b/>
+          <w:bCs/>
+        </w:rPr>
+        <w:t xml:space="preserve">Cardinalidade: </w:t>
+      </w:r>
+      <w:r>
+        <w:t xml:space="preserve">1:1 (uma comanda recebe no máximo uma avaliação; cada avaliação é de exatamente uma comanda)</w:t>
+      </w:r>
+    </w:p>
+    <w:p>
+      <w:pPr>
+        <w:spacing w:after="80"/>
+      </w:pPr>
+      <w:r>
+        <w:rPr>
+          <w:b/>
+          <w:bCs/>
+        </w:rPr>
+        <w:t xml:space="preserve">Participação: </w:t>
+      </w:r>
+      <w:r>
+        <w:t xml:space="preserve">opcional para Comanda (o cliente avalia se quiser); obrigatória para AvaliacaoAtendimento</w:t>
+      </w:r>
+    </w:p>
+    <w:p>
+      <w:pPr>
+        <w:spacing w:after="80"/>
+      </w:pPr>
+      <w:r>
+        <w:rPr>
+          <w:b/>
+          <w:bCs/>
+        </w:rPr>
+        <w:t xml:space="preserve">Entidades envolvidas: </w:t>
+      </w:r>
+      <w:r>
+        <w:t xml:space="preserve">ENT11, ENT04</w:t>
+      </w:r>
+    </w:p>
+    <w:p>
+      <w:pPr>
+        <w:spacing w:after="80"/>
+      </w:pPr>
+      <w:r>
+        <w:rPr>
+          <w:b/>
+          <w:bCs/>
+        </w:rPr>
+        <w:t xml:space="preserve">Regra de negócio: </w:t>
+      </w:r>
+      <w:r>
+        <w:t xml:space="preserve">RN08 — anônima, sem identificador de quem avaliou; só depois do fechamento da comanda e dentro de 24 horas; o Gerente vê apenas números agregados, e a média por garçom só entra no índice de desempenho com pelo menos 5 avaliações no período (RF25, RF11)</w:t>
       </w:r>
     </w:p>
     <w:sectPr>

</xml_diff>